<commit_message>
Update CV downloads and add JGO peer-review entry
Add Journal of Gastrointestinal Oncology to Peer Review Activities in cv.md (Manuscript #JGO-2026-0436-CL) and update the downloadable CV files (cv-downloads/aom-cv.docx, cv-downloads/aom-cv.pdf) to reflect this change.
</commit_message>
<xml_diff>
--- a/cv-downloads/aom-cv.docx
+++ b/cv-downloads/aom-cv.docx
@@ -2143,6 +2143,28 @@
       </w:pPr>
       <w:r>
         <w:t xml:space="preserve">Peer Review Activities</w:t>
+      </w:r>
+    </w:p>
+    <w:p>
+      <w:pPr>
+        <w:pStyle w:val="Compact"/>
+        <w:numPr>
+          <w:ilvl w:val="0"/>
+          <w:numId w:val="1019"/>
+        </w:numPr>
+      </w:pPr>
+      <w:r>
+        <w:rPr>
+          <w:b/>
+          <w:bCs/>
+        </w:rPr>
+        <w:t xml:space="preserve">Journal of Gastrointestinal Oncology</w:t>
+      </w:r>
+      <w:r>
+        <w:t xml:space="preserve"> </w:t>
+      </w:r>
+      <w:r>
+        <w:t xml:space="preserve">(2026) - Manuscript #JGO-2026-0436-CL</w:t>
       </w:r>
     </w:p>
     <w:p>

</xml_diff>

<commit_message>
Add QIMS peer-review certificate and update CV
Co-Authored-By: Claude Sonnet 5 <noreply@anthropic.com>
</commit_message>
<xml_diff>
--- a/cv-downloads/aom-cv.docx
+++ b/cv-downloads/aom-cv.docx
@@ -2,7 +2,7 @@
 <file path=word/document.xml><?xml version="1.0" encoding="utf-8"?>
 <w:document xmlns:w="http://schemas.openxmlformats.org/wordprocessingml/2006/main" xmlns:m="http://schemas.openxmlformats.org/officeDocument/2006/math" xmlns:r="http://schemas.openxmlformats.org/officeDocument/2006/relationships" xmlns:o="urn:schemas-microsoft-com:office:office" xmlns:v="urn:schemas-microsoft-com:vml" xmlns:w10="urn:schemas-microsoft-com:office:word" xmlns:a="http://schemas.openxmlformats.org/drawingml/2006/main" xmlns:pic="http://schemas.openxmlformats.org/drawingml/2006/picture" xmlns:wp="http://schemas.openxmlformats.org/drawingml/2006/wordprocessingDrawing">
   <w:body>
-    <w:bookmarkStart w:id="67" w:name="anthony-onde-morada-md"/>
+    <w:bookmarkStart w:id="71" w:name="anthony-onde-morada-md"/>
     <w:p>
       <w:pPr>
         <w:pStyle w:val="Heading1"/>
@@ -1051,7 +1051,7 @@
       </w:r>
     </w:p>
     <w:bookmarkEnd w:id="21"/>
-    <w:bookmarkStart w:id="55" w:name="publications"/>
+    <w:bookmarkStart w:id="59" w:name="publications"/>
     <w:p>
       <w:pPr>
         <w:pStyle w:val="Heading2"/>
@@ -1060,7 +1060,7 @@
         <w:t xml:space="preserve">Publications</w:t>
       </w:r>
     </w:p>
-    <w:bookmarkStart w:id="45" w:name="peer-reviewed-articles"/>
+    <w:bookmarkStart w:id="47" w:name="peer-reviewed-articles"/>
     <w:p>
       <w:pPr>
         <w:pStyle w:val="Heading3"/>
@@ -1097,7 +1097,7 @@
         <w:t xml:space="preserve">J Gastrointest Oncol</w:t>
       </w:r>
       <w:r>
-        <w:t xml:space="preserve">. 2026. doi: 10.21037/jgo-2026-1-0015. [</w:t>
+        <w:t xml:space="preserve">. 2026;17(3):175. doi: 10.21037/jgo-2026-1-0015. [</w:t>
       </w:r>
       <w:hyperlink r:id="rId22">
         <w:r>
@@ -1115,6 +1115,17 @@
           <w:rPr>
             <w:rStyle w:val="Hyperlink"/>
           </w:rPr>
+          <w:t xml:space="preserve">DOI</w:t>
+        </w:r>
+      </w:hyperlink>
+      <w:r>
+        <w:t xml:space="preserve">] [</w:t>
+      </w:r>
+      <w:hyperlink r:id="rId24">
+        <w:r>
+          <w:rPr>
+            <w:rStyle w:val="Hyperlink"/>
+          </w:rPr>
           <w:t xml:space="preserve">PDF</w:t>
         </w:r>
       </w:hyperlink>
@@ -1150,9 +1161,9 @@
         <w:t xml:space="preserve">Trauma Surgery &amp; Acute Care Open</w:t>
       </w:r>
       <w:r>
-        <w:t xml:space="preserve">. 2026;11:e002041. [</w:t>
-      </w:r>
-      <w:hyperlink r:id="rId24">
+        <w:t xml:space="preserve">. 2026;11(2):e002041. PMID: 42205709. [</w:t>
+      </w:r>
+      <w:hyperlink r:id="rId25">
         <w:r>
           <w:rPr>
             <w:rStyle w:val="Hyperlink"/>
@@ -1163,54 +1174,12 @@
       <w:r>
         <w:t xml:space="preserve">] [</w:t>
       </w:r>
-      <w:hyperlink r:id="rId25">
-        <w:r>
-          <w:rPr>
-            <w:rStyle w:val="Hyperlink"/>
-          </w:rPr>
-          <w:t xml:space="preserve">PDF</w:t>
-        </w:r>
-      </w:hyperlink>
-      <w:r>
-        <w:t xml:space="preserve">]</w:t>
-      </w:r>
-    </w:p>
-    <w:p>
-      <w:pPr>
-        <w:numPr>
-          <w:ilvl w:val="0"/>
-          <w:numId w:val="1015"/>
-        </w:numPr>
-      </w:pPr>
-      <w:r>
-        <w:rPr>
-          <w:b/>
-          <w:bCs/>
-        </w:rPr>
-        <w:t xml:space="preserve">Morada, AO</w:t>
-      </w:r>
-      <w:r>
-        <w:t xml:space="preserve">, Chen CK, Akateh C, Marvin MR, Kotru A. Late Parotid Recurrence of Hepatocellular Carcinoma Following Liver Transplantation: A Case Report,</w:t>
-      </w:r>
-      <w:r>
-        <w:t xml:space="preserve"> </w:t>
-      </w:r>
-      <w:r>
-        <w:rPr>
-          <w:i/>
-          <w:iCs/>
-        </w:rPr>
-        <w:t xml:space="preserve">Case Reports in Hepatology</w:t>
-      </w:r>
-      <w:r>
-        <w:t xml:space="preserve">, 2025, 2965476, 5 pages, 2025. [</w:t>
-      </w:r>
       <w:hyperlink r:id="rId26">
         <w:r>
           <w:rPr>
             <w:rStyle w:val="Hyperlink"/>
           </w:rPr>
-          <w:t xml:space="preserve">Full Text</w:t>
+          <w:t xml:space="preserve">PubMed</w:t>
         </w:r>
       </w:hyperlink>
       <w:r>
@@ -1236,20 +1205,14 @@
         </w:numPr>
       </w:pPr>
       <w:r>
-        <w:t xml:space="preserve">Bashiri A,</w:t>
-      </w:r>
-      <w:r>
-        <w:t xml:space="preserve"> </w:t>
-      </w:r>
-      <w:r>
-        <w:rPr>
-          <w:b/>
-          <w:bCs/>
-        </w:rPr>
-        <w:t xml:space="preserve">Morada AO</w:t>
-      </w:r>
-      <w:r>
-        <w:t xml:space="preserve">, Sultany M, Senapathi S, Silverman S, Casós S, Behm R. Trends of Trauma Admissions in a Rural Trauma Center During Coronavirus Disease 2019 Pandemic.</w:t>
+        <w:rPr>
+          <w:b/>
+          <w:bCs/>
+        </w:rPr>
+        <w:t xml:space="preserve">Morada, AO</w:t>
+      </w:r>
+      <w:r>
+        <w:t xml:space="preserve">, Chen CK, Akateh C, Marvin MR, Kotru A. Late Parotid Recurrence of Hepatocellular Carcinoma Following Liver Transplantation: A Case Report,</w:t>
       </w:r>
       <w:r>
         <w:t xml:space="preserve"> </w:t>
@@ -1259,10 +1222,10 @@
           <w:i/>
           <w:iCs/>
         </w:rPr>
-        <w:t xml:space="preserve">J Surg Res</w:t>
-      </w:r>
-      <w:r>
-        <w:t xml:space="preserve">. 2023;289:202-210. PMID: 37141703. [</w:t>
+        <w:t xml:space="preserve">Case Reports in Hepatology</w:t>
+      </w:r>
+      <w:r>
+        <w:t xml:space="preserve">, 2025, 2965476, 5 pages, 2025. [</w:t>
       </w:r>
       <w:hyperlink r:id="rId28">
         <w:r>
@@ -1280,13 +1243,72 @@
           <w:rPr>
             <w:rStyle w:val="Hyperlink"/>
           </w:rPr>
+          <w:t xml:space="preserve">PDF</w:t>
+        </w:r>
+      </w:hyperlink>
+      <w:r>
+        <w:t xml:space="preserve">]</w:t>
+      </w:r>
+    </w:p>
+    <w:p>
+      <w:pPr>
+        <w:numPr>
+          <w:ilvl w:val="0"/>
+          <w:numId w:val="1015"/>
+        </w:numPr>
+      </w:pPr>
+      <w:r>
+        <w:t xml:space="preserve">Bashiri A,</w:t>
+      </w:r>
+      <w:r>
+        <w:t xml:space="preserve"> </w:t>
+      </w:r>
+      <w:r>
+        <w:rPr>
+          <w:b/>
+          <w:bCs/>
+        </w:rPr>
+        <w:t xml:space="preserve">Morada AO</w:t>
+      </w:r>
+      <w:r>
+        <w:t xml:space="preserve">, Sultany M, Senapathi S, Silverman S, Casós S, Behm R. Trends of Trauma Admissions in a Rural Trauma Center During Coronavirus Disease 2019 Pandemic.</w:t>
+      </w:r>
+      <w:r>
+        <w:t xml:space="preserve"> </w:t>
+      </w:r>
+      <w:r>
+        <w:rPr>
+          <w:i/>
+          <w:iCs/>
+        </w:rPr>
+        <w:t xml:space="preserve">J Surg Res</w:t>
+      </w:r>
+      <w:r>
+        <w:t xml:space="preserve">. 2023;289:202-210. PMID: 37141703. [</w:t>
+      </w:r>
+      <w:hyperlink r:id="rId30">
+        <w:r>
+          <w:rPr>
+            <w:rStyle w:val="Hyperlink"/>
+          </w:rPr>
+          <w:t xml:space="preserve">Full Text</w:t>
+        </w:r>
+      </w:hyperlink>
+      <w:r>
+        <w:t xml:space="preserve">] [</w:t>
+      </w:r>
+      <w:hyperlink r:id="rId31">
+        <w:r>
+          <w:rPr>
+            <w:rStyle w:val="Hyperlink"/>
+          </w:rPr>
           <w:t xml:space="preserve">PubMed</w:t>
         </w:r>
       </w:hyperlink>
       <w:r>
         <w:t xml:space="preserve">] [</w:t>
       </w:r>
-      <w:hyperlink r:id="rId30">
+      <w:hyperlink r:id="rId32">
         <w:r>
           <w:rPr>
             <w:rStyle w:val="Hyperlink"/>
@@ -1334,7 +1356,7 @@
       <w:r>
         <w:t xml:space="preserve">. 2023;225(1):58-65. PMID: 36216612. [</w:t>
       </w:r>
-      <w:hyperlink r:id="rId31">
+      <w:hyperlink r:id="rId33">
         <w:r>
           <w:rPr>
             <w:rStyle w:val="Hyperlink"/>
@@ -1345,102 +1367,12 @@
       <w:r>
         <w:t xml:space="preserve">] [</w:t>
       </w:r>
-      <w:hyperlink r:id="rId32">
+      <w:hyperlink r:id="rId34">
         <w:r>
           <w:rPr>
             <w:rStyle w:val="Hyperlink"/>
           </w:rPr>
           <w:t xml:space="preserve">PubMed</w:t>
-        </w:r>
-      </w:hyperlink>
-      <w:r>
-        <w:t xml:space="preserve">] [</w:t>
-      </w:r>
-      <w:hyperlink r:id="rId33">
-        <w:r>
-          <w:rPr>
-            <w:rStyle w:val="Hyperlink"/>
-          </w:rPr>
-          <w:t xml:space="preserve">PDF</w:t>
-        </w:r>
-      </w:hyperlink>
-      <w:r>
-        <w:t xml:space="preserve">]</w:t>
-      </w:r>
-    </w:p>
-    <w:p>
-      <w:pPr>
-        <w:numPr>
-          <w:ilvl w:val="0"/>
-          <w:numId w:val="1015"/>
-        </w:numPr>
-      </w:pPr>
-      <w:r>
-        <w:t xml:space="preserve">Yeung E, Bertram C, Senapathi H, Perry M,</w:t>
-      </w:r>
-      <w:r>
-        <w:t xml:space="preserve"> </w:t>
-      </w:r>
-      <w:r>
-        <w:rPr>
-          <w:b/>
-          <w:bCs/>
-        </w:rPr>
-        <w:t xml:space="preserve">Morada AO</w:t>
-      </w:r>
-      <w:r>
-        <w:t xml:space="preserve">, Bertsch D, Cagir B. Evaluation of the survival outcomes of intestinal adenosquamous carcinomas using the SEER 18 registry: What do we know?</w:t>
-      </w:r>
-      <w:r>
-        <w:t xml:space="preserve"> </w:t>
-      </w:r>
-      <w:r>
-        <w:rPr>
-          <w:i/>
-          <w:iCs/>
-        </w:rPr>
-        <w:t xml:space="preserve">The Guthrie Journal</w:t>
-      </w:r>
-      <w:r>
-        <w:t xml:space="preserve">. 2023;75(1):7-16.</w:t>
-      </w:r>
-    </w:p>
-    <w:p>
-      <w:pPr>
-        <w:numPr>
-          <w:ilvl w:val="0"/>
-          <w:numId w:val="1015"/>
-        </w:numPr>
-      </w:pPr>
-      <w:r>
-        <w:rPr>
-          <w:b/>
-          <w:bCs/>
-        </w:rPr>
-        <w:t xml:space="preserve">Morada AO</w:t>
-      </w:r>
-      <w:r>
-        <w:t xml:space="preserve">, Senapathi SH, Bashiri A, Chai S, Cagir B. A systematic review of primary ileostomy site malignancies.</w:t>
-      </w:r>
-      <w:r>
-        <w:t xml:space="preserve"> </w:t>
-      </w:r>
-      <w:r>
-        <w:rPr>
-          <w:i/>
-          <w:iCs/>
-        </w:rPr>
-        <w:t xml:space="preserve">Surg Endosc</w:t>
-      </w:r>
-      <w:r>
-        <w:t xml:space="preserve">. 2022;36(3):1750-1760. PMID: 34997348. [</w:t>
-      </w:r>
-      <w:hyperlink r:id="rId34">
-        <w:r>
-          <w:rPr>
-            <w:rStyle w:val="Hyperlink"/>
-          </w:rPr>
-          <w:t xml:space="preserve">Full Text</w:t>
         </w:r>
       </w:hyperlink>
       <w:r>
@@ -1466,7 +1398,7 @@
         </w:numPr>
       </w:pPr>
       <w:r>
-        <w:t xml:space="preserve">Sundaram N,</w:t>
+        <w:t xml:space="preserve">Yeung E, Bertram C, Senapathi H, Perry M,</w:t>
       </w:r>
       <w:r>
         <w:t xml:space="preserve"> </w:t>
@@ -1479,7 +1411,7 @@
         <w:t xml:space="preserve">Morada AO</w:t>
       </w:r>
       <w:r>
-        <w:t xml:space="preserve">, Bashiri A, Cagir B. CT images demonstrating the natural progression of locally advanced partially treated rectal cancer.</w:t>
+        <w:t xml:space="preserve">, Bertsch D, Cagir B. Evaluation of the survival outcomes of intestinal adenosquamous carcinomas using the SEER 18 registry: What do we know?</w:t>
       </w:r>
       <w:r>
         <w:t xml:space="preserve"> </w:t>
@@ -1489,10 +1421,41 @@
           <w:i/>
           <w:iCs/>
         </w:rPr>
-        <w:t xml:space="preserve">BMJ Case Rep</w:t>
-      </w:r>
-      <w:r>
-        <w:t xml:space="preserve">. 2022;15(3):e247609. PMID: 35332009. [</w:t>
+        <w:t xml:space="preserve">The Guthrie Journal</w:t>
+      </w:r>
+      <w:r>
+        <w:t xml:space="preserve">. 2023;75(1):7-16.</w:t>
+      </w:r>
+    </w:p>
+    <w:p>
+      <w:pPr>
+        <w:numPr>
+          <w:ilvl w:val="0"/>
+          <w:numId w:val="1015"/>
+        </w:numPr>
+      </w:pPr>
+      <w:r>
+        <w:rPr>
+          <w:b/>
+          <w:bCs/>
+        </w:rPr>
+        <w:t xml:space="preserve">Morada AO</w:t>
+      </w:r>
+      <w:r>
+        <w:t xml:space="preserve">, Senapathi SH, Bashiri A, Chai S, Cagir B. A systematic review of primary ileostomy site malignancies.</w:t>
+      </w:r>
+      <w:r>
+        <w:t xml:space="preserve"> </w:t>
+      </w:r>
+      <w:r>
+        <w:rPr>
+          <w:i/>
+          <w:iCs/>
+        </w:rPr>
+        <w:t xml:space="preserve">Surg Endosc</w:t>
+      </w:r>
+      <w:r>
+        <w:t xml:space="preserve">. 2022;36(3):1750-1760. PMID: 34997348. [</w:t>
       </w:r>
       <w:hyperlink r:id="rId36">
         <w:r>
@@ -1510,66 +1473,66 @@
           <w:rPr>
             <w:rStyle w:val="Hyperlink"/>
           </w:rPr>
-          <w:t xml:space="preserve">PMC Free</w:t>
+          <w:t xml:space="preserve">PDF</w:t>
         </w:r>
       </w:hyperlink>
       <w:r>
-        <w:t xml:space="preserve">] [</w:t>
+        <w:t xml:space="preserve">]</w:t>
+      </w:r>
+    </w:p>
+    <w:p>
+      <w:pPr>
+        <w:numPr>
+          <w:ilvl w:val="0"/>
+          <w:numId w:val="1015"/>
+        </w:numPr>
+      </w:pPr>
+      <w:r>
+        <w:t xml:space="preserve">Sundaram N,</w:t>
+      </w:r>
+      <w:r>
+        <w:t xml:space="preserve"> </w:t>
+      </w:r>
+      <w:r>
+        <w:rPr>
+          <w:b/>
+          <w:bCs/>
+        </w:rPr>
+        <w:t xml:space="preserve">Morada AO</w:t>
+      </w:r>
+      <w:r>
+        <w:t xml:space="preserve">, Bashiri A, Cagir B. CT images demonstrating the natural progression of locally advanced partially treated rectal cancer.</w:t>
+      </w:r>
+      <w:r>
+        <w:t xml:space="preserve"> </w:t>
+      </w:r>
+      <w:r>
+        <w:rPr>
+          <w:i/>
+          <w:iCs/>
+        </w:rPr>
+        <w:t xml:space="preserve">BMJ Case Rep</w:t>
+      </w:r>
+      <w:r>
+        <w:t xml:space="preserve">. 2022;15(3):e247609. PMID: 35332009. [</w:t>
       </w:r>
       <w:hyperlink r:id="rId38">
         <w:r>
           <w:rPr>
             <w:rStyle w:val="Hyperlink"/>
           </w:rPr>
-          <w:t xml:space="preserve">PDF</w:t>
+          <w:t xml:space="preserve">Full Text</w:t>
         </w:r>
       </w:hyperlink>
       <w:r>
-        <w:t xml:space="preserve">]</w:t>
-      </w:r>
-    </w:p>
-    <w:p>
-      <w:pPr>
-        <w:numPr>
-          <w:ilvl w:val="0"/>
-          <w:numId w:val="1015"/>
-        </w:numPr>
-      </w:pPr>
-      <w:r>
-        <w:t xml:space="preserve">Senapathi H,</w:t>
-      </w:r>
-      <w:r>
-        <w:t xml:space="preserve"> </w:t>
-      </w:r>
-      <w:r>
-        <w:rPr>
-          <w:b/>
-          <w:bCs/>
-        </w:rPr>
-        <w:t xml:space="preserve">Morada AO</w:t>
-      </w:r>
-      <w:r>
-        <w:t xml:space="preserve">, Perry M, Bertram C, Yeung E, Sultany M, Bertsch D, Cagir B. Prognostic Factors in Gastrointestinal Leiomyosarcomas: An Analysis Using the SEER Database.</w:t>
-      </w:r>
-      <w:r>
-        <w:t xml:space="preserve"> </w:t>
-      </w:r>
-      <w:r>
-        <w:rPr>
-          <w:i/>
-          <w:iCs/>
-        </w:rPr>
-        <w:t xml:space="preserve">Cureus</w:t>
-      </w:r>
-      <w:r>
-        <w:t xml:space="preserve">. 2021;13(11):e19447. PMID: 34926025. [</w:t>
+        <w:t xml:space="preserve">] [</w:t>
       </w:r>
       <w:hyperlink r:id="rId39">
         <w:r>
           <w:rPr>
             <w:rStyle w:val="Hyperlink"/>
           </w:rPr>
-          <w:t xml:space="preserve">Full Text</w:t>
+          <w:t xml:space="preserve">PMC Free</w:t>
         </w:r>
       </w:hyperlink>
       <w:r>
@@ -1595,6 +1558,12 @@
         </w:numPr>
       </w:pPr>
       <w:r>
+        <w:t xml:space="preserve">Senapathi H,</w:t>
+      </w:r>
+      <w:r>
+        <w:t xml:space="preserve"> </w:t>
+      </w:r>
+      <w:r>
         <w:rPr>
           <w:b/>
           <w:bCs/>
@@ -1602,7 +1571,7 @@
         <w:t xml:space="preserve">Morada AO</w:t>
       </w:r>
       <w:r>
-        <w:t xml:space="preserve">, Scheidel C, Brown JL, Albright J, Kolade V, Cagir B. Predicting severe COVID-19 outcomes for triage and resource allocation.</w:t>
+        <w:t xml:space="preserve">, Perry M, Bertram C, Yeung E, Sultany M, Bertsch D, Cagir B. Prognostic Factors in Gastrointestinal Leiomyosarcomas: An Analysis Using the SEER Database.</w:t>
       </w:r>
       <w:r>
         <w:t xml:space="preserve"> </w:t>
@@ -1612,17 +1581,17 @@
           <w:i/>
           <w:iCs/>
         </w:rPr>
-        <w:t xml:space="preserve">MedRxiv</w:t>
-      </w:r>
-      <w:r>
-        <w:t xml:space="preserve">. 2021. [</w:t>
+        <w:t xml:space="preserve">Cureus</w:t>
+      </w:r>
+      <w:r>
+        <w:t xml:space="preserve">. 2021;13(11):e19447. PMID: 34926025. [</w:t>
       </w:r>
       <w:hyperlink r:id="rId41">
         <w:r>
           <w:rPr>
             <w:rStyle w:val="Hyperlink"/>
           </w:rPr>
-          <w:t xml:space="preserve">Preprint</w:t>
+          <w:t xml:space="preserve">Full Text</w:t>
         </w:r>
       </w:hyperlink>
       <w:r>
@@ -1648,20 +1617,14 @@
         </w:numPr>
       </w:pPr>
       <w:r>
-        <w:t xml:space="preserve">Guo H, Garcia-Vedrenne AE, Isserlin R, Lugowski A,</w:t>
-      </w:r>
-      <w:r>
-        <w:t xml:space="preserve"> </w:t>
-      </w:r>
-      <w:r>
-        <w:rPr>
-          <w:b/>
-          <w:bCs/>
-        </w:rPr>
-        <w:t xml:space="preserve">Morada A</w:t>
-      </w:r>
-      <w:r>
-        <w:t xml:space="preserve">, Sun A, Miao Y, Kuzmanov U, Wan C, Ma H, Foltz K, Emili A. Phosphoproteomic network analysis in the sea urchin</w:t>
+        <w:rPr>
+          <w:b/>
+          <w:bCs/>
+        </w:rPr>
+        <w:t xml:space="preserve">Morada AO</w:t>
+      </w:r>
+      <w:r>
+        <w:t xml:space="preserve">, Scheidel C, Brown JL, Albright J, Kolade V, Cagir B. Predicting severe COVID-19 outcomes for triage and resource allocation.</w:t>
       </w:r>
       <w:r>
         <w:t xml:space="preserve"> </w:t>
@@ -1671,13 +1634,56 @@
           <w:i/>
           <w:iCs/>
         </w:rPr>
-        <w:t xml:space="preserve">Strongylocentrotus purpuratus</w:t>
-      </w:r>
-      <w:r>
-        <w:t xml:space="preserve"> </w:t>
-      </w:r>
-      <w:r>
-        <w:t xml:space="preserve">reveals new candidates in egg activation.</w:t>
+        <w:t xml:space="preserve">MedRxiv</w:t>
+      </w:r>
+      <w:r>
+        <w:t xml:space="preserve">. 2021. [</w:t>
+      </w:r>
+      <w:hyperlink r:id="rId43">
+        <w:r>
+          <w:rPr>
+            <w:rStyle w:val="Hyperlink"/>
+          </w:rPr>
+          <w:t xml:space="preserve">Preprint</w:t>
+        </w:r>
+      </w:hyperlink>
+      <w:r>
+        <w:t xml:space="preserve">] [</w:t>
+      </w:r>
+      <w:hyperlink r:id="rId44">
+        <w:r>
+          <w:rPr>
+            <w:rStyle w:val="Hyperlink"/>
+          </w:rPr>
+          <w:t xml:space="preserve">PDF</w:t>
+        </w:r>
+      </w:hyperlink>
+      <w:r>
+        <w:t xml:space="preserve">]</w:t>
+      </w:r>
+    </w:p>
+    <w:p>
+      <w:pPr>
+        <w:numPr>
+          <w:ilvl w:val="0"/>
+          <w:numId w:val="1015"/>
+        </w:numPr>
+      </w:pPr>
+      <w:r>
+        <w:t xml:space="preserve">Guo H, Garcia-Vedrenne AE, Isserlin R, Lugowski A,</w:t>
+      </w:r>
+      <w:r>
+        <w:t xml:space="preserve"> </w:t>
+      </w:r>
+      <w:r>
+        <w:rPr>
+          <w:b/>
+          <w:bCs/>
+        </w:rPr>
+        <w:t xml:space="preserve">Morada A</w:t>
+      </w:r>
+      <w:r>
+        <w:t xml:space="preserve">, Sun A, Miao Y, Kuzmanov U, Wan C, Ma H, Foltz K, Emili A. Phosphoproteomic network analysis in the sea urchin</w:t>
       </w:r>
       <w:r>
         <w:t xml:space="preserve"> </w:t>
@@ -1687,12 +1693,28 @@
           <w:i/>
           <w:iCs/>
         </w:rPr>
+        <w:t xml:space="preserve">Strongylocentrotus purpuratus</w:t>
+      </w:r>
+      <w:r>
+        <w:t xml:space="preserve"> </w:t>
+      </w:r>
+      <w:r>
+        <w:t xml:space="preserve">reveals new candidates in egg activation.</w:t>
+      </w:r>
+      <w:r>
+        <w:t xml:space="preserve"> </w:t>
+      </w:r>
+      <w:r>
+        <w:rPr>
+          <w:i/>
+          <w:iCs/>
+        </w:rPr>
         <w:t xml:space="preserve">Proteomics</w:t>
       </w:r>
       <w:r>
         <w:t xml:space="preserve">. 2015;15(23-24):4080-4095. PMID: 26227301. [</w:t>
       </w:r>
-      <w:hyperlink r:id="rId43">
+      <w:hyperlink r:id="rId45">
         <w:r>
           <w:rPr>
             <w:rStyle w:val="Hyperlink"/>
@@ -1703,7 +1725,7 @@
       <w:r>
         <w:t xml:space="preserve">] [</w:t>
       </w:r>
-      <w:hyperlink r:id="rId44">
+      <w:hyperlink r:id="rId46">
         <w:r>
           <w:rPr>
             <w:rStyle w:val="Hyperlink"/>
@@ -1715,8 +1737,8 @@
         <w:t xml:space="preserve">]</w:t>
       </w:r>
     </w:p>
-    <w:bookmarkEnd w:id="45"/>
-    <w:bookmarkStart w:id="49" w:name="published-abstracts"/>
+    <w:bookmarkEnd w:id="47"/>
+    <w:bookmarkStart w:id="51" w:name="published-abstracts"/>
     <w:p>
       <w:pPr>
         <w:pStyle w:val="Heading3"/>
@@ -1760,244 +1782,6 @@
       </w:r>
       <w:r>
         <w:t xml:space="preserve">. 2025;81(6):e17-e18. doi: 10.1016/j.jvs.2025.03.075. [</w:t>
-      </w:r>
-      <w:hyperlink r:id="rId46">
-        <w:r>
-          <w:rPr>
-            <w:rStyle w:val="Hyperlink"/>
-          </w:rPr>
-          <w:t xml:space="preserve">PDF</w:t>
-        </w:r>
-      </w:hyperlink>
-      <w:r>
-        <w:t xml:space="preserve">]</w:t>
-      </w:r>
-    </w:p>
-    <w:p>
-      <w:pPr>
-        <w:numPr>
-          <w:ilvl w:val="0"/>
-          <w:numId w:val="1016"/>
-        </w:numPr>
-      </w:pPr>
-      <w:r>
-        <w:t xml:space="preserve">Guru S, Scharf M,</w:t>
-      </w:r>
-      <w:r>
-        <w:t xml:space="preserve"> </w:t>
-      </w:r>
-      <w:r>
-        <w:rPr>
-          <w:b/>
-          <w:bCs/>
-        </w:rPr>
-        <w:t xml:space="preserve">Morada AO</w:t>
-      </w:r>
-      <w:r>
-        <w:t xml:space="preserve">, Sundaram N, Senapathi S, Dombert L, Bashiri A, Cagir B. Systematic review of malignant transformation of perianal fistulae.</w:t>
-      </w:r>
-      <w:r>
-        <w:t xml:space="preserve"> </w:t>
-      </w:r>
-      <w:r>
-        <w:rPr>
-          <w:i/>
-          <w:iCs/>
-        </w:rPr>
-        <w:t xml:space="preserve">Dis Colon Rectum</w:t>
-      </w:r>
-      <w:r>
-        <w:t xml:space="preserve">. 2022;65(5):163.</w:t>
-      </w:r>
-    </w:p>
-    <w:p>
-      <w:pPr>
-        <w:numPr>
-          <w:ilvl w:val="0"/>
-          <w:numId w:val="1016"/>
-        </w:numPr>
-      </w:pPr>
-      <w:r>
-        <w:t xml:space="preserve">Senapathi H, Perry M,</w:t>
-      </w:r>
-      <w:r>
-        <w:t xml:space="preserve"> </w:t>
-      </w:r>
-      <w:r>
-        <w:rPr>
-          <w:b/>
-          <w:bCs/>
-        </w:rPr>
-        <w:t xml:space="preserve">Morada AO</w:t>
-      </w:r>
-      <w:r>
-        <w:t xml:space="preserve">, Bertram C, Yeung E, Bertsch D, Cagir B. Review of Intestinal Leiomyosarcomas: Epidemiology and Survival.</w:t>
-      </w:r>
-      <w:r>
-        <w:t xml:space="preserve"> </w:t>
-      </w:r>
-      <w:r>
-        <w:rPr>
-          <w:i/>
-          <w:iCs/>
-        </w:rPr>
-        <w:t xml:space="preserve">Ann Surg Oncol</w:t>
-      </w:r>
-      <w:r>
-        <w:t xml:space="preserve">. 2021;28(Suppl 1):S77-S78.</w:t>
-      </w:r>
-    </w:p>
-    <w:p>
-      <w:pPr>
-        <w:numPr>
-          <w:ilvl w:val="0"/>
-          <w:numId w:val="1016"/>
-        </w:numPr>
-      </w:pPr>
-      <w:r>
-        <w:t xml:space="preserve">Yeung E, Senapathi H, Perry M, Bertram C,</w:t>
-      </w:r>
-      <w:r>
-        <w:t xml:space="preserve"> </w:t>
-      </w:r>
-      <w:r>
-        <w:rPr>
-          <w:b/>
-          <w:bCs/>
-        </w:rPr>
-        <w:t xml:space="preserve">Morada AO</w:t>
-      </w:r>
-      <w:r>
-        <w:t xml:space="preserve">, Bertsch D, Cagir B. Evaluation of the Survival Outcomes of Intestinal Adenosquamous Carcinomas with SEER-18 Registry: What Do We Know?</w:t>
-      </w:r>
-      <w:r>
-        <w:t xml:space="preserve"> </w:t>
-      </w:r>
-      <w:r>
-        <w:rPr>
-          <w:i/>
-          <w:iCs/>
-        </w:rPr>
-        <w:t xml:space="preserve">Ann Surg Oncol</w:t>
-      </w:r>
-      <w:r>
-        <w:t xml:space="preserve">. 2021;28(Suppl 1):S79.</w:t>
-      </w:r>
-    </w:p>
-    <w:p>
-      <w:pPr>
-        <w:numPr>
-          <w:ilvl w:val="0"/>
-          <w:numId w:val="1016"/>
-        </w:numPr>
-      </w:pPr>
-      <w:r>
-        <w:t xml:space="preserve">Miller BN, Mehta P,</w:t>
-      </w:r>
-      <w:r>
-        <w:t xml:space="preserve"> </w:t>
-      </w:r>
-      <w:r>
-        <w:rPr>
-          <w:b/>
-          <w:bCs/>
-        </w:rPr>
-        <w:t xml:space="preserve">Morada AO</w:t>
-      </w:r>
-      <w:r>
-        <w:t xml:space="preserve">, Hendifar A, Annamalai A, Wachsman A, Dhall D, Nissen N. Age-Related Differences in Presentation and Management of Pancreatic Neuroendocrine Tumors.</w:t>
-      </w:r>
-      <w:r>
-        <w:t xml:space="preserve"> </w:t>
-      </w:r>
-      <w:r>
-        <w:rPr>
-          <w:i/>
-          <w:iCs/>
-        </w:rPr>
-        <w:t xml:space="preserve">Ann Surg Oncol</w:t>
-      </w:r>
-      <w:r>
-        <w:t xml:space="preserve">. 2017;24(Suppl):S127-S128.</w:t>
-      </w:r>
-    </w:p>
-    <w:p>
-      <w:pPr>
-        <w:numPr>
-          <w:ilvl w:val="0"/>
-          <w:numId w:val="1016"/>
-        </w:numPr>
-      </w:pPr>
-      <w:r>
-        <w:rPr>
-          <w:b/>
-          <w:bCs/>
-        </w:rPr>
-        <w:t xml:space="preserve">Morada AO</w:t>
-      </w:r>
-      <w:r>
-        <w:t xml:space="preserve">, Mehta P, Miller BN, Annamalai AA, Wachsman A, Gaddam S, Jamil LH, Lo SK, Nissen NN. Pancreatic fistula or leak after distal pancreatectomy: has anything changed? 13-year single surgeon experience.</w:t>
-      </w:r>
-      <w:r>
-        <w:t xml:space="preserve"> </w:t>
-      </w:r>
-      <w:r>
-        <w:rPr>
-          <w:i/>
-          <w:iCs/>
-        </w:rPr>
-        <w:t xml:space="preserve">Gastroenterology</w:t>
-      </w:r>
-      <w:r>
-        <w:t xml:space="preserve">. 2017;152(5 Suppl 1):S1272-S1273. doi: 10.1016/S0016-5085(17)34242-7. [</w:t>
-      </w:r>
-      <w:hyperlink r:id="rId47">
-        <w:r>
-          <w:rPr>
-            <w:rStyle w:val="Hyperlink"/>
-          </w:rPr>
-          <w:t xml:space="preserve">PDF</w:t>
-        </w:r>
-      </w:hyperlink>
-      <w:r>
-        <w:t xml:space="preserve">]</w:t>
-      </w:r>
-    </w:p>
-    <w:p>
-      <w:pPr>
-        <w:numPr>
-          <w:ilvl w:val="0"/>
-          <w:numId w:val="1016"/>
-        </w:numPr>
-      </w:pPr>
-      <w:r>
-        <w:t xml:space="preserve">Miller BN, Garnett G,</w:t>
-      </w:r>
-      <w:r>
-        <w:t xml:space="preserve"> </w:t>
-      </w:r>
-      <w:r>
-        <w:rPr>
-          <w:b/>
-          <w:bCs/>
-        </w:rPr>
-        <w:t xml:space="preserve">Morada AO</w:t>
-      </w:r>
-      <w:r>
-        <w:t xml:space="preserve">, Annamalai AA, Hendifar A, Dhall D, Lo SK, Wachsman A, Nissen NN. Parenchymal-Preserving Resection for Pancreatic Neuroendocrine Tumors: are the Outcomes Justified?</w:t>
-      </w:r>
-      <w:r>
-        <w:t xml:space="preserve"> </w:t>
-      </w:r>
-      <w:r>
-        <w:rPr>
-          <w:i/>
-          <w:iCs/>
-        </w:rPr>
-        <w:t xml:space="preserve">Gastroenterology</w:t>
-      </w:r>
-      <w:r>
-        <w:t xml:space="preserve">. 2017;152(5 Suppl 1):S1274. doi: 10.1016/S0016-5085(17)34247-6. [</w:t>
       </w:r>
       <w:hyperlink r:id="rId48">
         <w:r>
@@ -2011,24 +1795,19 @@
         <w:t xml:space="preserve">]</w:t>
       </w:r>
     </w:p>
-    <w:bookmarkEnd w:id="49"/>
-    <w:bookmarkStart w:id="50" w:name="manuscripts-under-reviewin-preparation"/>
-    <w:p>
-      <w:pPr>
-        <w:pStyle w:val="Heading3"/>
-      </w:pPr>
-      <w:r>
-        <w:t xml:space="preserve">Manuscripts Under Review/In Preparation</w:t>
-      </w:r>
-    </w:p>
-    <w:p>
-      <w:pPr>
-        <w:pStyle w:val="Compact"/>
-        <w:numPr>
-          <w:ilvl w:val="0"/>
-          <w:numId w:val="1017"/>
-        </w:numPr>
-      </w:pPr>
+    <w:p>
+      <w:pPr>
+        <w:numPr>
+          <w:ilvl w:val="0"/>
+          <w:numId w:val="1016"/>
+        </w:numPr>
+      </w:pPr>
+      <w:r>
+        <w:t xml:space="preserve">Guru S, Scharf M,</w:t>
+      </w:r>
+      <w:r>
+        <w:t xml:space="preserve"> </w:t>
+      </w:r>
       <w:r>
         <w:rPr>
           <w:b/>
@@ -2037,7 +1816,7 @@
         <w:t xml:space="preserve">Morada AO</w:t>
       </w:r>
       <w:r>
-        <w:t xml:space="preserve">, Becker JL, Furey MJ, Summa CH, Richards KR, Bodde J, Jordan RM, Bannon JP, Falvo A. Building a Better Sub-Internship Evaluation: A Multi-Stakeholder Approach.</w:t>
+        <w:t xml:space="preserve">, Sundaram N, Senapathi S, Dombert L, Bashiri A, Cagir B. Systematic review of malignant transformation of perianal fistulae.</w:t>
       </w:r>
       <w:r>
         <w:t xml:space="preserve"> </w:t>
@@ -2047,27 +1826,25 @@
           <w:i/>
           <w:iCs/>
         </w:rPr>
-        <w:t xml:space="preserve">Manuscript in preparation for submission to Global Surgical Education: Journal of the Association for Surgical Education.</w:t>
-      </w:r>
-    </w:p>
-    <w:bookmarkEnd w:id="50"/>
-    <w:bookmarkStart w:id="52" w:name="media-publications"/>
-    <w:p>
-      <w:pPr>
-        <w:pStyle w:val="Heading3"/>
-      </w:pPr>
-      <w:r>
-        <w:t xml:space="preserve">Media &amp; Publications</w:t>
-      </w:r>
-    </w:p>
-    <w:p>
-      <w:pPr>
-        <w:pStyle w:val="Compact"/>
-        <w:numPr>
-          <w:ilvl w:val="0"/>
-          <w:numId w:val="1018"/>
-        </w:numPr>
-      </w:pPr>
+        <w:t xml:space="preserve">Dis Colon Rectum</w:t>
+      </w:r>
+      <w:r>
+        <w:t xml:space="preserve">. 2022;65(5):163.</w:t>
+      </w:r>
+    </w:p>
+    <w:p>
+      <w:pPr>
+        <w:numPr>
+          <w:ilvl w:val="0"/>
+          <w:numId w:val="1016"/>
+        </w:numPr>
+      </w:pPr>
+      <w:r>
+        <w:t xml:space="preserve">Senapathi H, Perry M,</w:t>
+      </w:r>
+      <w:r>
+        <w:t xml:space="preserve"> </w:t>
+      </w:r>
       <w:r>
         <w:rPr>
           <w:b/>
@@ -2076,7 +1853,7 @@
         <w:t xml:space="preserve">Morada AO</w:t>
       </w:r>
       <w:r>
-        <w:t xml:space="preserve">, Mackarey P. Finding your way clear of opioid problems.</w:t>
+        <w:t xml:space="preserve">, Bertram C, Yeung E, Bertsch D, Cagir B. Review of Intestinal Leiomyosarcomas: Epidemiology and Survival.</w:t>
       </w:r>
       <w:r>
         <w:t xml:space="preserve"> </w:t>
@@ -2086,12 +1863,257 @@
           <w:i/>
           <w:iCs/>
         </w:rPr>
+        <w:t xml:space="preserve">Ann Surg Oncol</w:t>
+      </w:r>
+      <w:r>
+        <w:t xml:space="preserve">. 2021;28(Suppl 1):S77-S78.</w:t>
+      </w:r>
+    </w:p>
+    <w:p>
+      <w:pPr>
+        <w:numPr>
+          <w:ilvl w:val="0"/>
+          <w:numId w:val="1016"/>
+        </w:numPr>
+      </w:pPr>
+      <w:r>
+        <w:t xml:space="preserve">Yeung E, Senapathi H, Perry M, Bertram C,</w:t>
+      </w:r>
+      <w:r>
+        <w:t xml:space="preserve"> </w:t>
+      </w:r>
+      <w:r>
+        <w:rPr>
+          <w:b/>
+          <w:bCs/>
+        </w:rPr>
+        <w:t xml:space="preserve">Morada AO</w:t>
+      </w:r>
+      <w:r>
+        <w:t xml:space="preserve">, Bertsch D, Cagir B. Evaluation of the Survival Outcomes of Intestinal Adenosquamous Carcinomas with SEER-18 Registry: What Do We Know?</w:t>
+      </w:r>
+      <w:r>
+        <w:t xml:space="preserve"> </w:t>
+      </w:r>
+      <w:r>
+        <w:rPr>
+          <w:i/>
+          <w:iCs/>
+        </w:rPr>
+        <w:t xml:space="preserve">Ann Surg Oncol</w:t>
+      </w:r>
+      <w:r>
+        <w:t xml:space="preserve">. 2021;28(Suppl 1):S79.</w:t>
+      </w:r>
+    </w:p>
+    <w:p>
+      <w:pPr>
+        <w:numPr>
+          <w:ilvl w:val="0"/>
+          <w:numId w:val="1016"/>
+        </w:numPr>
+      </w:pPr>
+      <w:r>
+        <w:t xml:space="preserve">Miller BN, Mehta P,</w:t>
+      </w:r>
+      <w:r>
+        <w:t xml:space="preserve"> </w:t>
+      </w:r>
+      <w:r>
+        <w:rPr>
+          <w:b/>
+          <w:bCs/>
+        </w:rPr>
+        <w:t xml:space="preserve">Morada AO</w:t>
+      </w:r>
+      <w:r>
+        <w:t xml:space="preserve">, Hendifar A, Annamalai A, Wachsman A, Dhall D, Nissen N. Age-Related Differences in Presentation and Management of Pancreatic Neuroendocrine Tumors.</w:t>
+      </w:r>
+      <w:r>
+        <w:t xml:space="preserve"> </w:t>
+      </w:r>
+      <w:r>
+        <w:rPr>
+          <w:i/>
+          <w:iCs/>
+        </w:rPr>
+        <w:t xml:space="preserve">Ann Surg Oncol</w:t>
+      </w:r>
+      <w:r>
+        <w:t xml:space="preserve">. 2017;24(Suppl):S127-S128.</w:t>
+      </w:r>
+    </w:p>
+    <w:p>
+      <w:pPr>
+        <w:numPr>
+          <w:ilvl w:val="0"/>
+          <w:numId w:val="1016"/>
+        </w:numPr>
+      </w:pPr>
+      <w:r>
+        <w:rPr>
+          <w:b/>
+          <w:bCs/>
+        </w:rPr>
+        <w:t xml:space="preserve">Morada AO</w:t>
+      </w:r>
+      <w:r>
+        <w:t xml:space="preserve">, Mehta P, Miller BN, Annamalai AA, Wachsman A, Gaddam S, Jamil LH, Lo SK, Nissen NN. Pancreatic fistula or leak after distal pancreatectomy: has anything changed? 13-year single surgeon experience.</w:t>
+      </w:r>
+      <w:r>
+        <w:t xml:space="preserve"> </w:t>
+      </w:r>
+      <w:r>
+        <w:rPr>
+          <w:i/>
+          <w:iCs/>
+        </w:rPr>
+        <w:t xml:space="preserve">Gastroenterology</w:t>
+      </w:r>
+      <w:r>
+        <w:t xml:space="preserve">. 2017;152(5 Suppl 1):S1272-S1273. doi: 10.1016/S0016-5085(17)34242-7. [</w:t>
+      </w:r>
+      <w:hyperlink r:id="rId49">
+        <w:r>
+          <w:rPr>
+            <w:rStyle w:val="Hyperlink"/>
+          </w:rPr>
+          <w:t xml:space="preserve">PDF</w:t>
+        </w:r>
+      </w:hyperlink>
+      <w:r>
+        <w:t xml:space="preserve">]</w:t>
+      </w:r>
+    </w:p>
+    <w:p>
+      <w:pPr>
+        <w:numPr>
+          <w:ilvl w:val="0"/>
+          <w:numId w:val="1016"/>
+        </w:numPr>
+      </w:pPr>
+      <w:r>
+        <w:t xml:space="preserve">Miller BN, Garnett G,</w:t>
+      </w:r>
+      <w:r>
+        <w:t xml:space="preserve"> </w:t>
+      </w:r>
+      <w:r>
+        <w:rPr>
+          <w:b/>
+          <w:bCs/>
+        </w:rPr>
+        <w:t xml:space="preserve">Morada AO</w:t>
+      </w:r>
+      <w:r>
+        <w:t xml:space="preserve">, Annamalai AA, Hendifar A, Dhall D, Lo SK, Wachsman A, Nissen NN. Parenchymal-Preserving Resection for Pancreatic Neuroendocrine Tumors: are the Outcomes Justified?</w:t>
+      </w:r>
+      <w:r>
+        <w:t xml:space="preserve"> </w:t>
+      </w:r>
+      <w:r>
+        <w:rPr>
+          <w:i/>
+          <w:iCs/>
+        </w:rPr>
+        <w:t xml:space="preserve">Gastroenterology</w:t>
+      </w:r>
+      <w:r>
+        <w:t xml:space="preserve">. 2017;152(5 Suppl 1):S1274. doi: 10.1016/S0016-5085(17)34247-6. [</w:t>
+      </w:r>
+      <w:hyperlink r:id="rId50">
+        <w:r>
+          <w:rPr>
+            <w:rStyle w:val="Hyperlink"/>
+          </w:rPr>
+          <w:t xml:space="preserve">PDF</w:t>
+        </w:r>
+      </w:hyperlink>
+      <w:r>
+        <w:t xml:space="preserve">]</w:t>
+      </w:r>
+    </w:p>
+    <w:bookmarkEnd w:id="51"/>
+    <w:bookmarkStart w:id="52" w:name="manuscripts-under-reviewin-preparation"/>
+    <w:p>
+      <w:pPr>
+        <w:pStyle w:val="Heading3"/>
+      </w:pPr>
+      <w:r>
+        <w:t xml:space="preserve">Manuscripts Under Review/In Preparation</w:t>
+      </w:r>
+    </w:p>
+    <w:p>
+      <w:pPr>
+        <w:pStyle w:val="Compact"/>
+        <w:numPr>
+          <w:ilvl w:val="0"/>
+          <w:numId w:val="1017"/>
+        </w:numPr>
+      </w:pPr>
+      <w:r>
+        <w:rPr>
+          <w:b/>
+          <w:bCs/>
+        </w:rPr>
+        <w:t xml:space="preserve">Morada AO</w:t>
+      </w:r>
+      <w:r>
+        <w:t xml:space="preserve">, Becker JL, Furey MJ, Summa CH, Richards KR, Bodde J, Jordan RM, Bannon JP, Falvo A. Building a Better Sub-Internship Evaluation: A Multi-Stakeholder Approach.</w:t>
+      </w:r>
+      <w:r>
+        <w:t xml:space="preserve"> </w:t>
+      </w:r>
+      <w:r>
+        <w:rPr>
+          <w:i/>
+          <w:iCs/>
+        </w:rPr>
+        <w:t xml:space="preserve">Manuscript in preparation for submission to Global Surgical Education: Journal of the Association for Surgical Education.</w:t>
+      </w:r>
+    </w:p>
+    <w:bookmarkEnd w:id="52"/>
+    <w:bookmarkStart w:id="54" w:name="media-publications"/>
+    <w:p>
+      <w:pPr>
+        <w:pStyle w:val="Heading3"/>
+      </w:pPr>
+      <w:r>
+        <w:t xml:space="preserve">Media &amp; Publications</w:t>
+      </w:r>
+    </w:p>
+    <w:p>
+      <w:pPr>
+        <w:pStyle w:val="Compact"/>
+        <w:numPr>
+          <w:ilvl w:val="0"/>
+          <w:numId w:val="1018"/>
+        </w:numPr>
+      </w:pPr>
+      <w:r>
+        <w:rPr>
+          <w:b/>
+          <w:bCs/>
+        </w:rPr>
+        <w:t xml:space="preserve">Morada AO</w:t>
+      </w:r>
+      <w:r>
+        <w:t xml:space="preserve">, Mackarey P. Finding your way clear of opioid problems.</w:t>
+      </w:r>
+      <w:r>
+        <w:t xml:space="preserve"> </w:t>
+      </w:r>
+      <w:r>
+        <w:rPr>
+          <w:i/>
+          <w:iCs/>
+        </w:rPr>
         <w:t xml:space="preserve">The Scranton Times-Tribune</w:t>
       </w:r>
       <w:r>
         <w:t xml:space="preserve">. August 27, 2018. [</w:t>
       </w:r>
-      <w:hyperlink r:id="rId51">
+      <w:hyperlink r:id="rId53">
         <w:r>
           <w:rPr>
             <w:rStyle w:val="Hyperlink"/>
@@ -2135,8 +2157,8 @@
         <w:t xml:space="preserve">. December 2017.</w:t>
       </w:r>
     </w:p>
-    <w:bookmarkEnd w:id="52"/>
-    <w:bookmarkStart w:id="54" w:name="peer-review-activities"/>
+    <w:bookmarkEnd w:id="54"/>
+    <w:bookmarkStart w:id="58" w:name="peer-review-activities"/>
     <w:p>
       <w:pPr>
         <w:pStyle w:val="Heading3"/>
@@ -2158,37 +2180,15 @@
           <w:b/>
           <w:bCs/>
         </w:rPr>
-        <w:t xml:space="preserve">Journal of Gastrointestinal Oncology</w:t>
-      </w:r>
-      <w:r>
-        <w:t xml:space="preserve"> </w:t>
-      </w:r>
-      <w:r>
-        <w:t xml:space="preserve">(2026) - Manuscript #JGO-2026-0436-CL</w:t>
-      </w:r>
-    </w:p>
-    <w:p>
-      <w:pPr>
-        <w:pStyle w:val="Compact"/>
-        <w:numPr>
-          <w:ilvl w:val="0"/>
-          <w:numId w:val="1019"/>
-        </w:numPr>
-      </w:pPr>
-      <w:r>
-        <w:rPr>
-          <w:b/>
-          <w:bCs/>
-        </w:rPr>
-        <w:t xml:space="preserve">HepatoBiliary Surgery and Nutrition</w:t>
-      </w:r>
-      <w:r>
-        <w:t xml:space="preserve"> </w:t>
-      </w:r>
-      <w:r>
-        <w:t xml:space="preserve">(2026) - Manuscript #HBSN-2026-0250 [</w:t>
-      </w:r>
-      <w:hyperlink r:id="rId53">
+        <w:t xml:space="preserve">Quantitative Imaging in Medicine and Surgery</w:t>
+      </w:r>
+      <w:r>
+        <w:t xml:space="preserve"> </w:t>
+      </w:r>
+      <w:r>
+        <w:t xml:space="preserve">(2026) - Manuscript #QIMS-2026-1692 [</w:t>
+      </w:r>
+      <w:hyperlink r:id="rId55">
         <w:r>
           <w:rPr>
             <w:rStyle w:val="Hyperlink"/>
@@ -2213,6 +2213,72 @@
           <w:b/>
           <w:bCs/>
         </w:rPr>
+        <w:t xml:space="preserve">Journal of Gastrointestinal Oncology</w:t>
+      </w:r>
+      <w:r>
+        <w:t xml:space="preserve"> </w:t>
+      </w:r>
+      <w:r>
+        <w:t xml:space="preserve">(2026) - Manuscript #JGO-2026-0436-CL [</w:t>
+      </w:r>
+      <w:hyperlink r:id="rId56">
+        <w:r>
+          <w:rPr>
+            <w:rStyle w:val="Hyperlink"/>
+          </w:rPr>
+          <w:t xml:space="preserve">Certificate</w:t>
+        </w:r>
+      </w:hyperlink>
+      <w:r>
+        <w:t xml:space="preserve">]</w:t>
+      </w:r>
+    </w:p>
+    <w:p>
+      <w:pPr>
+        <w:pStyle w:val="Compact"/>
+        <w:numPr>
+          <w:ilvl w:val="0"/>
+          <w:numId w:val="1019"/>
+        </w:numPr>
+      </w:pPr>
+      <w:r>
+        <w:rPr>
+          <w:b/>
+          <w:bCs/>
+        </w:rPr>
+        <w:t xml:space="preserve">HepatoBiliary Surgery and Nutrition</w:t>
+      </w:r>
+      <w:r>
+        <w:t xml:space="preserve"> </w:t>
+      </w:r>
+      <w:r>
+        <w:t xml:space="preserve">(2026) - Manuscript #HBSN-2026-0250 [</w:t>
+      </w:r>
+      <w:hyperlink r:id="rId57">
+        <w:r>
+          <w:rPr>
+            <w:rStyle w:val="Hyperlink"/>
+          </w:rPr>
+          <w:t xml:space="preserve">Certificate</w:t>
+        </w:r>
+      </w:hyperlink>
+      <w:r>
+        <w:t xml:space="preserve">]</w:t>
+      </w:r>
+    </w:p>
+    <w:p>
+      <w:pPr>
+        <w:pStyle w:val="Compact"/>
+        <w:numPr>
+          <w:ilvl w:val="0"/>
+          <w:numId w:val="1019"/>
+        </w:numPr>
+      </w:pPr>
+      <w:r>
+        <w:rPr>
+          <w:b/>
+          <w:bCs/>
+        </w:rPr>
         <w:t xml:space="preserve">Cancer Medicine</w:t>
       </w:r>
       <w:r>
@@ -2354,9 +2420,9 @@
         <w:t xml:space="preserve">(2021) - Manuscript #M21-2536</w:t>
       </w:r>
     </w:p>
-    <w:bookmarkEnd w:id="54"/>
-    <w:bookmarkEnd w:id="55"/>
-    <w:bookmarkStart w:id="60" w:name="presentations"/>
+    <w:bookmarkEnd w:id="58"/>
+    <w:bookmarkEnd w:id="59"/>
+    <w:bookmarkStart w:id="64" w:name="presentations"/>
     <w:p>
       <w:pPr>
         <w:pStyle w:val="Heading2"/>
@@ -2365,7 +2431,7 @@
         <w:t xml:space="preserve">Presentations</w:t>
       </w:r>
     </w:p>
-    <w:bookmarkStart w:id="56" w:name="oral-presentations"/>
+    <w:bookmarkStart w:id="60" w:name="oral-presentations"/>
     <w:p>
       <w:pPr>
         <w:pStyle w:val="Heading3"/>
@@ -2701,8 +2767,8 @@
         <w:t xml:space="preserve">, Seattle, WA, March 2017.</w:t>
       </w:r>
     </w:p>
-    <w:bookmarkEnd w:id="56"/>
-    <w:bookmarkStart w:id="59" w:name="poster-presentations"/>
+    <w:bookmarkEnd w:id="60"/>
+    <w:bookmarkStart w:id="63" w:name="poster-presentations"/>
     <w:p>
       <w:pPr>
         <w:pStyle w:val="Heading3"/>
@@ -2744,7 +2810,7 @@
       <w:r>
         <w:t xml:space="preserve"> </w:t>
       </w:r>
-      <w:hyperlink r:id="rId57">
+      <w:hyperlink r:id="rId61">
         <w:r>
           <w:rPr>
             <w:rStyle w:val="Hyperlink"/>
@@ -2786,7 +2852,7 @@
       <w:r>
         <w:t xml:space="preserve"> </w:t>
       </w:r>
-      <w:hyperlink r:id="rId58">
+      <w:hyperlink r:id="rId62">
         <w:r>
           <w:rPr>
             <w:rStyle w:val="Hyperlink"/>
@@ -3493,9 +3559,9 @@
         <w:t xml:space="preserve">, Santa Barbara, CA, May 2013.</w:t>
       </w:r>
     </w:p>
-    <w:bookmarkEnd w:id="59"/>
-    <w:bookmarkEnd w:id="60"/>
-    <w:bookmarkStart w:id="61" w:name="honors-and-awards"/>
+    <w:bookmarkEnd w:id="63"/>
+    <w:bookmarkEnd w:id="64"/>
+    <w:bookmarkStart w:id="65" w:name="honors-and-awards"/>
     <w:p>
       <w:pPr>
         <w:pStyle w:val="Heading2"/>
@@ -3649,8 +3715,8 @@
         <w:t xml:space="preserve">, UC Santa Barbara (2013, 2014)</w:t>
       </w:r>
     </w:p>
-    <w:bookmarkEnd w:id="61"/>
-    <w:bookmarkStart w:id="62" w:name="leadership-and-service"/>
+    <w:bookmarkEnd w:id="65"/>
+    <w:bookmarkStart w:id="66" w:name="leadership-and-service"/>
     <w:p>
       <w:pPr>
         <w:pStyle w:val="Heading2"/>
@@ -3985,8 +4051,8 @@
         <w:t xml:space="preserve">Rotational volunteer experience across multiple clinical departments including emergency medicine and surgery</w:t>
       </w:r>
     </w:p>
-    <w:bookmarkEnd w:id="62"/>
-    <w:bookmarkStart w:id="63" w:name="technical-skills-and-certifications"/>
+    <w:bookmarkEnd w:id="66"/>
+    <w:bookmarkStart w:id="67" w:name="technical-skills-and-certifications"/>
     <w:p>
       <w:pPr>
         <w:pStyle w:val="Heading2"/>
@@ -4203,8 +4269,8 @@
         <w:t xml:space="preserve">Emergency Medical Technician - California EMSA License E084811 (2011-2017)</w:t>
       </w:r>
     </w:p>
-    <w:bookmarkEnd w:id="63"/>
-    <w:bookmarkStart w:id="64" w:name="professional-memberships"/>
+    <w:bookmarkEnd w:id="67"/>
+    <w:bookmarkStart w:id="68" w:name="professional-memberships"/>
     <w:p>
       <w:pPr>
         <w:pStyle w:val="Heading2"/>
@@ -4281,8 +4347,8 @@
         <w:t xml:space="preserve">Pennsylvania Medical Society</w:t>
       </w:r>
     </w:p>
-    <w:bookmarkEnd w:id="64"/>
-    <w:bookmarkStart w:id="65" w:name="cultural-competencies"/>
+    <w:bookmarkEnd w:id="68"/>
+    <w:bookmarkStart w:id="69" w:name="cultural-competencies"/>
     <w:p>
       <w:pPr>
         <w:pStyle w:val="Heading2"/>
@@ -4299,8 +4365,8 @@
         <w:t xml:space="preserve">Trained in: Transgender Health, Safe Zone (LGBTQ+), Cross-Cultural Communication, Microaggression Awareness, Community Action Poverty Simulation, Psychiatric Disability Empathy, People with Disabilities as Teachers (PDAT) — Geisinger Commonwealth School of Medicine, 2017</w:t>
       </w:r>
     </w:p>
-    <w:bookmarkEnd w:id="65"/>
-    <w:bookmarkStart w:id="66" w:name="personal-interests"/>
+    <w:bookmarkEnd w:id="69"/>
+    <w:bookmarkStart w:id="70" w:name="personal-interests"/>
     <w:p>
       <w:pPr>
         <w:pStyle w:val="Heading2"/>
@@ -4321,8 +4387,8 @@
         <w:t xml:space="preserve">Photography, Programming (R, Python), Fantasy Sports, Fitness (hiking, cycling, running)</w:t>
       </w:r>
     </w:p>
-    <w:bookmarkEnd w:id="66"/>
-    <w:bookmarkEnd w:id="67"/>
+    <w:bookmarkEnd w:id="70"/>
+    <w:bookmarkEnd w:id="71"/>
     <w:sectPr>
       <w:footnotePr>
         <w:numRestart w:val="eachSect"/>

</xml_diff>